<commit_message>
Added GutHub Pages HTML files, Makefile, READMEs
</commit_message>
<xml_diff>
--- a/Mandelbrot.docx
+++ b/Mandelbrot.docx
@@ -1175,7 +1175,23 @@
           <w:sz w:val="24"/>
           <w:szCs w:val="24"/>
         </w:rPr>
-        <w:t>the point definitely escapes</w:t>
+        <w:t xml:space="preserve">the </w:t>
+      </w:r>
+      <w:r>
+        <w:rPr>
+          <w:rFonts w:ascii="Arial" w:eastAsiaTheme="minorEastAsia" w:hAnsi="Arial" w:cs="Arial"/>
+          <w:sz w:val="24"/>
+          <w:szCs w:val="24"/>
+        </w:rPr>
+        <w:t>orbit</w:t>
+      </w:r>
+      <w:r>
+        <w:rPr>
+          <w:rFonts w:ascii="Arial" w:eastAsiaTheme="minorEastAsia" w:hAnsi="Arial" w:cs="Arial"/>
+          <w:sz w:val="24"/>
+          <w:szCs w:val="24"/>
+        </w:rPr>
+        <w:t xml:space="preserve"> definitely escapes</w:t>
       </w:r>
       <w:r>
         <w:rPr>
@@ -1874,6 +1890,34 @@
           <m:t>=0</m:t>
         </m:r>
       </m:oMath>
+    </w:p>
+    <w:p>
+      <w:pPr>
+        <w:ind w:left="360"/>
+        <w:rPr>
+          <w:rFonts w:ascii="Arial" w:eastAsiaTheme="minorEastAsia" w:hAnsi="Arial" w:cs="Arial"/>
+          <w:sz w:val="24"/>
+          <w:szCs w:val="24"/>
+        </w:rPr>
+      </w:pPr>
+      <w:proofErr w:type="gramStart"/>
+      <w:r>
+        <w:rPr>
+          <w:rFonts w:ascii="Arial" w:eastAsiaTheme="minorEastAsia" w:hAnsi="Arial" w:cs="Arial"/>
+          <w:sz w:val="24"/>
+          <w:szCs w:val="24"/>
+        </w:rPr>
+        <w:t>we</w:t>
+      </w:r>
+      <w:proofErr w:type="gramEnd"/>
+      <w:r>
+        <w:rPr>
+          <w:rFonts w:ascii="Arial" w:eastAsiaTheme="minorEastAsia" w:hAnsi="Arial" w:cs="Arial"/>
+          <w:sz w:val="24"/>
+          <w:szCs w:val="24"/>
+        </w:rPr>
+        <w:t xml:space="preserve"> have</w:t>
+      </w:r>
     </w:p>
     <w:p>
       <w:pPr>
@@ -1979,6 +2023,365 @@
               <w:szCs w:val="24"/>
             </w:rPr>
             <m:t>+ c</m:t>
+          </m:r>
+        </m:oMath>
+      </m:oMathPara>
+    </w:p>
+    <w:p>
+      <w:pPr>
+        <w:autoSpaceDE w:val="0"/>
+        <w:autoSpaceDN w:val="0"/>
+        <w:adjustRightInd w:val="0"/>
+        <w:spacing w:line="240" w:lineRule="auto"/>
+        <w:ind w:left="360"/>
+        <w:rPr>
+          <w:rFonts w:ascii="Arial" w:eastAsiaTheme="minorEastAsia" w:hAnsi="Arial" w:cs="Arial"/>
+          <w:sz w:val="24"/>
+          <w:szCs w:val="24"/>
+        </w:rPr>
+      </w:pPr>
+      <w:r>
+        <w:rPr>
+          <w:rFonts w:ascii="Arial" w:eastAsiaTheme="minorEastAsia" w:hAnsi="Arial" w:cs="Arial"/>
+          <w:sz w:val="24"/>
+          <w:szCs w:val="24"/>
+        </w:rPr>
+        <w:t>Writing</w:t>
+      </w:r>
+    </w:p>
+    <w:p>
+      <w:pPr>
+        <w:autoSpaceDE w:val="0"/>
+        <w:autoSpaceDN w:val="0"/>
+        <w:adjustRightInd w:val="0"/>
+        <w:spacing w:line="240" w:lineRule="auto"/>
+        <w:ind w:left="360"/>
+        <w:jc w:val="center"/>
+        <w:rPr>
+          <w:rFonts w:ascii="Arial" w:eastAsiaTheme="minorEastAsia" w:hAnsi="Arial" w:cs="Arial"/>
+          <w:sz w:val="24"/>
+          <w:szCs w:val="24"/>
+        </w:rPr>
+      </w:pPr>
+      <m:oMath>
+        <m:sSub>
+          <m:sSubPr>
+            <m:ctrlPr>
+              <w:rPr>
+                <w:rFonts w:ascii="Cambria Math" w:eastAsiaTheme="minorEastAsia" w:hAnsi="Cambria Math" w:cs="Arial"/>
+                <w:i/>
+                <w:sz w:val="24"/>
+                <w:szCs w:val="24"/>
+              </w:rPr>
+            </m:ctrlPr>
+          </m:sSubPr>
+          <m:e>
+            <m:r>
+              <w:rPr>
+                <w:rFonts w:ascii="Cambria Math" w:eastAsiaTheme="minorEastAsia" w:hAnsi="Cambria Math" w:cs="Arial"/>
+                <w:sz w:val="24"/>
+                <w:szCs w:val="24"/>
+              </w:rPr>
+              <m:t>z</m:t>
+            </m:r>
+          </m:e>
+          <m:sub>
+            <m:r>
+              <w:rPr>
+                <w:rFonts w:ascii="Cambria Math" w:eastAsiaTheme="minorEastAsia" w:hAnsi="Cambria Math" w:cs="Arial"/>
+                <w:sz w:val="24"/>
+                <w:szCs w:val="24"/>
+              </w:rPr>
+              <m:t>n</m:t>
+            </m:r>
+          </m:sub>
+        </m:sSub>
+        <m:r>
+          <w:rPr>
+            <w:rFonts w:ascii="Cambria Math" w:eastAsiaTheme="minorEastAsia" w:hAnsi="Cambria Math" w:cs="Arial"/>
+            <w:sz w:val="24"/>
+            <w:szCs w:val="24"/>
+          </w:rPr>
+          <m:t xml:space="preserve">= </m:t>
+        </m:r>
+        <m:sSub>
+          <m:sSubPr>
+            <m:ctrlPr>
+              <w:rPr>
+                <w:rFonts w:ascii="Cambria Math" w:eastAsiaTheme="minorEastAsia" w:hAnsi="Cambria Math" w:cs="Arial"/>
+                <w:i/>
+                <w:sz w:val="24"/>
+                <w:szCs w:val="24"/>
+              </w:rPr>
+            </m:ctrlPr>
+          </m:sSubPr>
+          <m:e>
+            <m:r>
+              <w:rPr>
+                <w:rFonts w:ascii="Cambria Math" w:eastAsiaTheme="minorEastAsia" w:hAnsi="Cambria Math" w:cs="Arial"/>
+                <w:sz w:val="24"/>
+                <w:szCs w:val="24"/>
+              </w:rPr>
+              <m:t>u</m:t>
+            </m:r>
+          </m:e>
+          <m:sub>
+            <m:r>
+              <w:rPr>
+                <w:rFonts w:ascii="Cambria Math" w:eastAsiaTheme="minorEastAsia" w:hAnsi="Cambria Math" w:cs="Arial"/>
+                <w:sz w:val="24"/>
+                <w:szCs w:val="24"/>
+              </w:rPr>
+              <m:t>n</m:t>
+            </m:r>
+          </m:sub>
+        </m:sSub>
+        <m:r>
+          <w:rPr>
+            <w:rFonts w:ascii="Cambria Math" w:eastAsiaTheme="minorEastAsia" w:hAnsi="Cambria Math" w:cs="Arial"/>
+            <w:sz w:val="24"/>
+            <w:szCs w:val="24"/>
+          </w:rPr>
+          <m:t>+i</m:t>
+        </m:r>
+        <m:sSub>
+          <m:sSubPr>
+            <m:ctrlPr>
+              <w:rPr>
+                <w:rFonts w:ascii="Cambria Math" w:eastAsiaTheme="minorEastAsia" w:hAnsi="Cambria Math" w:cs="Arial"/>
+                <w:i/>
+                <w:sz w:val="24"/>
+                <w:szCs w:val="24"/>
+              </w:rPr>
+            </m:ctrlPr>
+          </m:sSubPr>
+          <m:e>
+            <m:r>
+              <w:rPr>
+                <w:rFonts w:ascii="Cambria Math" w:eastAsiaTheme="minorEastAsia" w:hAnsi="Cambria Math" w:cs="Arial"/>
+                <w:sz w:val="24"/>
+                <w:szCs w:val="24"/>
+              </w:rPr>
+              <m:t>v</m:t>
+            </m:r>
+          </m:e>
+          <m:sub>
+            <m:r>
+              <w:rPr>
+                <w:rFonts w:ascii="Cambria Math" w:eastAsiaTheme="minorEastAsia" w:hAnsi="Cambria Math" w:cs="Arial"/>
+                <w:sz w:val="24"/>
+                <w:szCs w:val="24"/>
+              </w:rPr>
+              <m:t>n</m:t>
+            </m:r>
+          </m:sub>
+        </m:sSub>
+      </m:oMath>
+      <w:r>
+        <w:rPr>
+          <w:rFonts w:ascii="Arial" w:eastAsiaTheme="minorEastAsia" w:hAnsi="Arial" w:cs="Arial"/>
+          <w:sz w:val="24"/>
+          <w:szCs w:val="24"/>
+        </w:rPr>
+        <w:t>,</w:t>
+      </w:r>
+    </w:p>
+    <w:p>
+      <w:pPr>
+        <w:autoSpaceDE w:val="0"/>
+        <w:autoSpaceDN w:val="0"/>
+        <w:adjustRightInd w:val="0"/>
+        <w:spacing w:line="240" w:lineRule="auto"/>
+        <w:ind w:left="360"/>
+        <w:rPr>
+          <w:rFonts w:ascii="Arial" w:eastAsiaTheme="minorEastAsia" w:hAnsi="Arial" w:cs="Arial"/>
+          <w:sz w:val="24"/>
+          <w:szCs w:val="24"/>
+        </w:rPr>
+      </w:pPr>
+      <w:proofErr w:type="gramStart"/>
+      <w:r>
+        <w:rPr>
+          <w:rFonts w:ascii="Arial" w:eastAsiaTheme="minorEastAsia" w:hAnsi="Arial" w:cs="Arial"/>
+          <w:sz w:val="24"/>
+          <w:szCs w:val="24"/>
+        </w:rPr>
+        <w:t>gives</w:t>
+      </w:r>
+      <w:proofErr w:type="gramEnd"/>
+    </w:p>
+    <w:p>
+      <w:pPr>
+        <w:autoSpaceDE w:val="0"/>
+        <w:autoSpaceDN w:val="0"/>
+        <w:adjustRightInd w:val="0"/>
+        <w:spacing w:line="240" w:lineRule="auto"/>
+        <w:ind w:left="360"/>
+        <w:rPr>
+          <w:rFonts w:ascii="Arial" w:eastAsiaTheme="minorEastAsia" w:hAnsi="Arial" w:cs="Arial"/>
+          <w:sz w:val="24"/>
+          <w:szCs w:val="24"/>
+        </w:rPr>
+      </w:pPr>
+      <m:oMathPara>
+        <m:oMath>
+          <m:sSub>
+            <m:sSubPr>
+              <m:ctrlPr>
+                <w:rPr>
+                  <w:rFonts w:ascii="Cambria Math" w:eastAsiaTheme="minorEastAsia" w:hAnsi="Cambria Math" w:cs="Arial"/>
+                  <w:i/>
+                  <w:sz w:val="24"/>
+                  <w:szCs w:val="24"/>
+                </w:rPr>
+              </m:ctrlPr>
+            </m:sSubPr>
+            <m:e>
+              <m:r>
+                <w:rPr>
+                  <w:rFonts w:ascii="Cambria Math" w:eastAsiaTheme="minorEastAsia" w:hAnsi="Cambria Math" w:cs="Arial"/>
+                  <w:sz w:val="24"/>
+                  <w:szCs w:val="24"/>
+                </w:rPr>
+                <m:t>z</m:t>
+              </m:r>
+            </m:e>
+            <m:sub>
+              <m:r>
+                <w:rPr>
+                  <w:rFonts w:ascii="Cambria Math" w:eastAsiaTheme="minorEastAsia" w:hAnsi="Cambria Math" w:cs="Arial"/>
+                  <w:sz w:val="24"/>
+                  <w:szCs w:val="24"/>
+                </w:rPr>
+                <m:t>n+1</m:t>
+              </m:r>
+            </m:sub>
+          </m:sSub>
+          <m:r>
+            <w:rPr>
+              <w:rFonts w:ascii="Cambria Math" w:eastAsiaTheme="minorEastAsia" w:hAnsi="Cambria Math" w:cs="Arial"/>
+              <w:sz w:val="24"/>
+              <w:szCs w:val="24"/>
+            </w:rPr>
+            <m:t xml:space="preserve">= </m:t>
+          </m:r>
+          <m:sSup>
+            <m:sSupPr>
+              <m:ctrlPr>
+                <w:rPr>
+                  <w:rFonts w:ascii="Cambria Math" w:eastAsiaTheme="minorEastAsia" w:hAnsi="Cambria Math" w:cs="Arial"/>
+                  <w:i/>
+                  <w:sz w:val="24"/>
+                  <w:szCs w:val="24"/>
+                </w:rPr>
+              </m:ctrlPr>
+            </m:sSupPr>
+            <m:e>
+              <m:d>
+                <m:dPr>
+                  <m:ctrlPr>
+                    <w:rPr>
+                      <w:rFonts w:ascii="Cambria Math" w:eastAsiaTheme="minorEastAsia" w:hAnsi="Cambria Math" w:cs="Arial"/>
+                      <w:i/>
+                      <w:sz w:val="24"/>
+                      <w:szCs w:val="24"/>
+                    </w:rPr>
+                  </m:ctrlPr>
+                </m:dPr>
+                <m:e>
+                  <m:sSub>
+                    <m:sSubPr>
+                      <m:ctrlPr>
+                        <w:rPr>
+                          <w:rFonts w:ascii="Cambria Math" w:eastAsiaTheme="minorEastAsia" w:hAnsi="Cambria Math" w:cs="Arial"/>
+                          <w:i/>
+                          <w:sz w:val="24"/>
+                          <w:szCs w:val="24"/>
+                        </w:rPr>
+                      </m:ctrlPr>
+                    </m:sSubPr>
+                    <m:e>
+                      <m:r>
+                        <w:rPr>
+                          <w:rFonts w:ascii="Cambria Math" w:eastAsiaTheme="minorEastAsia" w:hAnsi="Cambria Math" w:cs="Arial"/>
+                          <w:sz w:val="24"/>
+                          <w:szCs w:val="24"/>
+                        </w:rPr>
+                        <m:t>u</m:t>
+                      </m:r>
+                    </m:e>
+                    <m:sub>
+                      <m:r>
+                        <w:rPr>
+                          <w:rFonts w:ascii="Cambria Math" w:eastAsiaTheme="minorEastAsia" w:hAnsi="Cambria Math" w:cs="Arial"/>
+                          <w:sz w:val="24"/>
+                          <w:szCs w:val="24"/>
+                        </w:rPr>
+                        <m:t>n</m:t>
+                      </m:r>
+                    </m:sub>
+                  </m:sSub>
+                  <m:r>
+                    <w:rPr>
+                      <w:rFonts w:ascii="Cambria Math" w:eastAsiaTheme="minorEastAsia" w:hAnsi="Cambria Math" w:cs="Arial"/>
+                      <w:sz w:val="24"/>
+                      <w:szCs w:val="24"/>
+                    </w:rPr>
+                    <m:t>+i</m:t>
+                  </m:r>
+                  <m:sSub>
+                    <m:sSubPr>
+                      <m:ctrlPr>
+                        <w:rPr>
+                          <w:rFonts w:ascii="Cambria Math" w:eastAsiaTheme="minorEastAsia" w:hAnsi="Cambria Math" w:cs="Arial"/>
+                          <w:i/>
+                          <w:sz w:val="24"/>
+                          <w:szCs w:val="24"/>
+                        </w:rPr>
+                      </m:ctrlPr>
+                    </m:sSubPr>
+                    <m:e>
+                      <m:r>
+                        <w:rPr>
+                          <w:rFonts w:ascii="Cambria Math" w:eastAsiaTheme="minorEastAsia" w:hAnsi="Cambria Math" w:cs="Arial"/>
+                          <w:sz w:val="24"/>
+                          <w:szCs w:val="24"/>
+                        </w:rPr>
+                        <m:t>v</m:t>
+                      </m:r>
+                    </m:e>
+                    <m:sub>
+                      <m:r>
+                        <w:rPr>
+                          <w:rFonts w:ascii="Cambria Math" w:eastAsiaTheme="minorEastAsia" w:hAnsi="Cambria Math" w:cs="Arial"/>
+                          <w:sz w:val="24"/>
+                          <w:szCs w:val="24"/>
+                        </w:rPr>
+                        <m:t>n</m:t>
+                      </m:r>
+                    </m:sub>
+                  </m:sSub>
+                </m:e>
+              </m:d>
+            </m:e>
+            <m:sup>
+              <m:r>
+                <w:rPr>
+                  <w:rFonts w:ascii="Cambria Math" w:eastAsiaTheme="minorEastAsia" w:hAnsi="Cambria Math" w:cs="Arial"/>
+                  <w:sz w:val="24"/>
+                  <w:szCs w:val="24"/>
+                </w:rPr>
+                <m:t>2</m:t>
+              </m:r>
+            </m:sup>
+          </m:sSup>
+          <m:r>
+            <w:rPr>
+              <w:rFonts w:ascii="Cambria Math" w:eastAsiaTheme="minorEastAsia" w:hAnsi="Cambria Math" w:cs="Arial"/>
+              <w:sz w:val="24"/>
+              <w:szCs w:val="24"/>
+            </w:rPr>
+            <m:t>+c</m:t>
           </m:r>
         </m:oMath>
       </m:oMathPara>
@@ -3326,49 +3729,23 @@
           <w:sz w:val="24"/>
           <w:szCs w:val="24"/>
         </w:rPr>
-        <w:t xml:space="preserve">, then </w:t>
-      </w:r>
-      <m:oMath>
-        <m:sSub>
-          <m:sSubPr>
-            <m:ctrlPr>
-              <w:rPr>
-                <w:rFonts w:ascii="Cambria Math" w:hAnsi="Cambria Math" w:cs="Arial"/>
-                <w:i/>
-                <w:sz w:val="24"/>
-                <w:szCs w:val="24"/>
-              </w:rPr>
-            </m:ctrlPr>
-          </m:sSubPr>
-          <m:e>
-            <m:r>
-              <w:rPr>
-                <w:rFonts w:ascii="Cambria Math" w:hAnsi="Cambria Math" w:cs="Arial"/>
-                <w:sz w:val="24"/>
-                <w:szCs w:val="24"/>
-              </w:rPr>
-              <m:t>z</m:t>
-            </m:r>
-          </m:e>
-          <m:sub>
-            <m:r>
-              <w:rPr>
-                <w:rFonts w:ascii="Cambria Math" w:hAnsi="Cambria Math" w:cs="Arial"/>
-                <w:sz w:val="24"/>
-                <w:szCs w:val="24"/>
-              </w:rPr>
-              <m:t>∞</m:t>
-            </m:r>
-          </m:sub>
-        </m:sSub>
-      </m:oMath>
-      <w:r>
-        <w:rPr>
-          <w:rFonts w:ascii="Arial" w:eastAsiaTheme="minorEastAsia" w:hAnsi="Arial" w:cs="Arial"/>
-          <w:sz w:val="24"/>
-          <w:szCs w:val="24"/>
-        </w:rPr>
-        <w:t xml:space="preserve"> will become unbounded. Therefore, </w:t>
+        <w:t>, then</w:t>
+      </w:r>
+      <w:r>
+        <w:rPr>
+          <w:rFonts w:ascii="Arial" w:eastAsiaTheme="minorEastAsia" w:hAnsi="Arial" w:cs="Arial"/>
+          <w:sz w:val="24"/>
+          <w:szCs w:val="24"/>
+        </w:rPr>
+        <w:t xml:space="preserve"> the orbit </w:t>
+      </w:r>
+      <w:r>
+        <w:rPr>
+          <w:rFonts w:ascii="Arial" w:eastAsiaTheme="minorEastAsia" w:hAnsi="Arial" w:cs="Arial"/>
+          <w:sz w:val="24"/>
+          <w:szCs w:val="24"/>
+        </w:rPr>
+        <w:t xml:space="preserve">will become unbounded. Therefore, </w:t>
       </w:r>
       <w:r>
         <w:rPr>
@@ -4808,7 +5185,23 @@
           <w:sz w:val="24"/>
           <w:szCs w:val="24"/>
         </w:rPr>
-        <w:t xml:space="preserve"> has progressed much</w:t>
+        <w:t xml:space="preserve"> </w:t>
+      </w:r>
+      <w:r>
+        <w:rPr>
+          <w:rFonts w:ascii="Arial" w:hAnsi="Arial" w:cs="Arial"/>
+          <w:sz w:val="24"/>
+          <w:szCs w:val="24"/>
+        </w:rPr>
+        <w:t xml:space="preserve">orbit </w:t>
+      </w:r>
+      <w:r>
+        <w:rPr>
+          <w:rFonts w:ascii="Arial" w:hAnsi="Arial" w:cs="Arial"/>
+          <w:sz w:val="24"/>
+          <w:szCs w:val="24"/>
+        </w:rPr>
+        <w:t>has progressed much</w:t>
       </w:r>
       <w:r>
         <w:rPr>
@@ -10007,16 +10400,15 @@
           <w:sz w:val="24"/>
           <w:szCs w:val="24"/>
         </w:rPr>
-        <w:t xml:space="preserve">Consider the same </w:t>
-      </w:r>
-      <w:r>
-        <w:rPr>
-          <w:rFonts w:ascii="Arial" w:eastAsiaTheme="minorEastAsia" w:hAnsi="Arial" w:cs="Arial"/>
-          <w:i/>
-          <w:sz w:val="24"/>
-          <w:szCs w:val="24"/>
-        </w:rPr>
-        <w:t>z</w:t>
+        <w:t>Consider the same</w:t>
+      </w:r>
+      <w:r>
+        <w:rPr>
+          <w:rFonts w:ascii="Arial" w:eastAsiaTheme="minorEastAsia" w:hAnsi="Arial" w:cs="Arial"/>
+          <w:sz w:val="24"/>
+          <w:szCs w:val="24"/>
+        </w:rPr>
+        <w:t xml:space="preserve"> orbit</w:t>
       </w:r>
       <w:r>
         <w:rPr>
@@ -15531,7 +15923,17 @@
           <w:sz w:val="24"/>
           <w:szCs w:val="24"/>
         </w:rPr>
-        <w:t>Dividing by log 2 makes each Mandelbrot iteration correspond to an increment of approximately one.</w:t>
+        <w:t>Dividing by ln</w:t>
+      </w:r>
+      <w:bookmarkStart w:id="0" w:name="_GoBack"/>
+      <w:bookmarkEnd w:id="0"/>
+      <w:r>
+        <w:rPr>
+          <w:rFonts w:ascii="Arial" w:eastAsiaTheme="minorEastAsia" w:hAnsi="Arial" w:cs="Arial"/>
+          <w:sz w:val="24"/>
+          <w:szCs w:val="24"/>
+        </w:rPr>
+        <w:t xml:space="preserve"> 2 makes each Mandelbrot iteration correspond to an increment of approximately one.</w:t>
       </w:r>
     </w:p>
     <w:p>
@@ -16652,17 +17054,7 @@
           <w:sz w:val="24"/>
           <w:szCs w:val="24"/>
         </w:rPr>
-        <w:t xml:space="preserve">This is mathematically </w:t>
-      </w:r>
-      <w:bookmarkStart w:id="0" w:name="_GoBack"/>
-      <w:bookmarkEnd w:id="0"/>
-      <w:r>
-        <w:rPr>
-          <w:rFonts w:ascii="Arial" w:eastAsiaTheme="minorEastAsia" w:hAnsi="Arial" w:cs="Arial"/>
-          <w:sz w:val="24"/>
-          <w:szCs w:val="24"/>
-        </w:rPr>
-        <w:t>equivalent.</w:t>
+        <w:t>This is mathematically equivalent.</w:t>
       </w:r>
     </w:p>
     <w:p>
@@ -20189,7 +20581,15 @@
           <w:sz w:val="24"/>
           <w:szCs w:val="24"/>
         </w:rPr>
-        <w:t>point</w:t>
+        <w:t>orbi</w:t>
+      </w:r>
+      <w:r>
+        <w:rPr>
+          <w:rFonts w:ascii="Arial" w:eastAsiaTheme="minorEastAsia" w:hAnsi="Arial" w:cs="Arial"/>
+          <w:sz w:val="24"/>
+          <w:szCs w:val="24"/>
+        </w:rPr>
+        <w:t>t</w:t>
       </w:r>
       <w:r>
         <w:rPr>
@@ -25530,7 +25930,59 @@
           <w:sz w:val="24"/>
           <w:szCs w:val="24"/>
         </w:rPr>
-        <w:t xml:space="preserve"> to be replaced by a smoothly varying scalar field.</w:t>
+        <w:t xml:space="preserve"> to </w:t>
+      </w:r>
+      <w:proofErr w:type="gramStart"/>
+      <w:r>
+        <w:rPr>
+          <w:rFonts w:ascii="Arial" w:eastAsiaTheme="minorEastAsia" w:hAnsi="Arial" w:cs="Arial"/>
+          <w:sz w:val="24"/>
+          <w:szCs w:val="24"/>
+        </w:rPr>
+        <w:t>be replaced</w:t>
+      </w:r>
+      <w:proofErr w:type="gramEnd"/>
+      <w:r>
+        <w:rPr>
+          <w:rFonts w:ascii="Arial" w:eastAsiaTheme="minorEastAsia" w:hAnsi="Arial" w:cs="Arial"/>
+          <w:sz w:val="24"/>
+          <w:szCs w:val="24"/>
+        </w:rPr>
+        <w:t xml:space="preserve"> by a smoothly varying scalar field.</w:t>
+      </w:r>
+    </w:p>
+    <w:p>
+      <w:pPr>
+        <w:rPr>
+          <w:rFonts w:ascii="Arial" w:eastAsiaTheme="minorEastAsia" w:hAnsi="Arial" w:cs="Arial"/>
+          <w:sz w:val="18"/>
+          <w:szCs w:val="18"/>
+        </w:rPr>
+      </w:pPr>
+      <w:r>
+        <w:rPr>
+          <w:rFonts w:ascii="Arial" w:eastAsiaTheme="minorEastAsia" w:hAnsi="Arial" w:cs="Arial"/>
+          <w:sz w:val="18"/>
+          <w:szCs w:val="18"/>
+        </w:rPr>
+        <w:t>Copyright 2026 P. David Buchan (pdbuchan@gmail.com)</w:t>
+      </w:r>
+    </w:p>
+    <w:p>
+      <w:pPr>
+        <w:rPr>
+          <w:rFonts w:ascii="Arial" w:eastAsiaTheme="minorEastAsia" w:hAnsi="Arial" w:cs="Arial"/>
+          <w:sz w:val="18"/>
+          <w:szCs w:val="18"/>
+        </w:rPr>
+      </w:pPr>
+      <w:r>
+        <w:rPr>
+          <w:rFonts w:ascii="Arial" w:eastAsiaTheme="minorEastAsia" w:hAnsi="Arial" w:cs="Arial"/>
+          <w:sz w:val="18"/>
+          <w:szCs w:val="18"/>
+        </w:rPr>
+        <w:t>Licensed under the **GNU Free Documentation License, version 1.3 or any later version**, with no Invariant Sections, no Front-Cover Texts, and no Back-Cover Texts.</w:t>
       </w:r>
     </w:p>
     <w:sectPr>
@@ -25603,7 +26055,7 @@
           <w:rPr>
             <w:noProof/>
           </w:rPr>
-          <w:t>13</w:t>
+          <w:t>19</w:t>
         </w:r>
         <w:r>
           <w:rPr>
@@ -27203,6 +27655,558 @@
 </w:styles>
 </file>
 
+<file path=word/glossary/document.xml><?xml version="1.0" encoding="utf-8"?>
+<w:glossaryDocument xmlns:wpc="http://schemas.microsoft.com/office/word/2010/wordprocessingCanvas" xmlns:cx="http://schemas.microsoft.com/office/drawing/2014/chartex" xmlns:cx1="http://schemas.microsoft.com/office/drawing/2015/9/8/chartex" xmlns:mc="http://schemas.openxmlformats.org/markup-compatibility/2006" xmlns:o="urn:schemas-microsoft-com:office:office" xmlns:r="http://schemas.openxmlformats.org/officeDocument/2006/relationships" xmlns:m="http://schemas.openxmlformats.org/officeDocument/2006/math" xmlns:v="urn:schemas-microsoft-com:vml" xmlns:wp14="http://schemas.microsoft.com/office/word/2010/wordprocessingDrawing" xmlns:wp="http://schemas.openxmlformats.org/drawingml/2006/wordprocessingDrawing" xmlns:w10="urn:schemas-microsoft-com:office:word" xmlns:w="http://schemas.openxmlformats.org/wordprocessingml/2006/main" xmlns:w14="http://schemas.microsoft.com/office/word/2010/wordml" xmlns:w15="http://schemas.microsoft.com/office/word/2012/wordml" xmlns:w16se="http://schemas.microsoft.com/office/word/2015/wordml/symex" xmlns:wpg="http://schemas.microsoft.com/office/word/2010/wordprocessingGroup" xmlns:wpi="http://schemas.microsoft.com/office/word/2010/wordprocessingInk" xmlns:wne="http://schemas.microsoft.com/office/word/2006/wordml" xmlns:wps="http://schemas.microsoft.com/office/word/2010/wordprocessingShape" mc:Ignorable="w14 w15 w16se wp14"/>
+</file>
+
+<file path=word/glossary/fontTable.xml><?xml version="1.0" encoding="utf-8"?>
+<w:fonts xmlns:mc="http://schemas.openxmlformats.org/markup-compatibility/2006" xmlns:r="http://schemas.openxmlformats.org/officeDocument/2006/relationships" xmlns:w="http://schemas.openxmlformats.org/wordprocessingml/2006/main" xmlns:w14="http://schemas.microsoft.com/office/word/2010/wordml" xmlns:w15="http://schemas.microsoft.com/office/word/2012/wordml" xmlns:w16se="http://schemas.microsoft.com/office/word/2015/wordml/symex" mc:Ignorable="w14 w15 w16se">
+  <w:font w:name="Symbol">
+    <w:panose1 w:val="05050102010706020507"/>
+    <w:charset w:val="02"/>
+    <w:family w:val="roman"/>
+    <w:pitch w:val="variable"/>
+    <w:sig w:usb0="00000000" w:usb1="10000000" w:usb2="00000000" w:usb3="00000000" w:csb0="80000000" w:csb1="00000000"/>
+  </w:font>
+  <w:font w:name="Times New Roman">
+    <w:panose1 w:val="02020603050405020304"/>
+    <w:charset w:val="00"/>
+    <w:family w:val="roman"/>
+    <w:pitch w:val="variable"/>
+    <w:sig w:usb0="E0002EFF" w:usb1="C000785B" w:usb2="00000009" w:usb3="00000000" w:csb0="000001FF" w:csb1="00000000"/>
+  </w:font>
+  <w:font w:name="Courier New">
+    <w:panose1 w:val="02070309020205020404"/>
+    <w:charset w:val="00"/>
+    <w:family w:val="modern"/>
+    <w:pitch w:val="fixed"/>
+    <w:sig w:usb0="E0002EFF" w:usb1="C0007843" w:usb2="00000009" w:usb3="00000000" w:csb0="000001FF" w:csb1="00000000"/>
+  </w:font>
+  <w:font w:name="Wingdings">
+    <w:panose1 w:val="05000000000000000000"/>
+    <w:charset w:val="02"/>
+    <w:family w:val="auto"/>
+    <w:pitch w:val="variable"/>
+    <w:sig w:usb0="00000000" w:usb1="10000000" w:usb2="00000000" w:usb3="00000000" w:csb0="80000000" w:csb1="00000000"/>
+  </w:font>
+  <w:font w:name="Calibri">
+    <w:panose1 w:val="020F0502020204030204"/>
+    <w:charset w:val="00"/>
+    <w:family w:val="swiss"/>
+    <w:pitch w:val="variable"/>
+    <w:sig w:usb0="E4002EFF" w:usb1="C200247B" w:usb2="00000009" w:usb3="00000000" w:csb0="000001FF" w:csb1="00000000"/>
+  </w:font>
+  <w:font w:name="Calibri Light">
+    <w:panose1 w:val="020F0302020204030204"/>
+    <w:charset w:val="00"/>
+    <w:family w:val="swiss"/>
+    <w:pitch w:val="variable"/>
+    <w:sig w:usb0="E4002EFF" w:usb1="C200247B" w:usb2="00000009" w:usb3="00000000" w:csb0="000001FF" w:csb1="00000000"/>
+  </w:font>
+  <w:font w:name="Segoe UI">
+    <w:panose1 w:val="020B0502040204020203"/>
+    <w:charset w:val="00"/>
+    <w:family w:val="swiss"/>
+    <w:pitch w:val="variable"/>
+    <w:sig w:usb0="E4002EFF" w:usb1="C000E47F" w:usb2="00000009" w:usb3="00000000" w:csb0="000001FF" w:csb1="00000000"/>
+  </w:font>
+  <w:font w:name="Arial">
+    <w:panose1 w:val="020B0604020202020204"/>
+    <w:charset w:val="00"/>
+    <w:family w:val="swiss"/>
+    <w:pitch w:val="variable"/>
+    <w:sig w:usb0="E0002EFF" w:usb1="C000785B" w:usb2="00000009" w:usb3="00000000" w:csb0="000001FF" w:csb1="00000000"/>
+  </w:font>
+  <w:font w:name="Cambria Math">
+    <w:panose1 w:val="02040503050406030204"/>
+    <w:charset w:val="00"/>
+    <w:family w:val="roman"/>
+    <w:pitch w:val="variable"/>
+    <w:sig w:usb0="E00006FF" w:usb1="420024FF" w:usb2="02000000" w:usb3="00000000" w:csb0="0000019F" w:csb1="00000000"/>
+  </w:font>
+</w:fonts>
+</file>
+
+<file path=word/glossary/settings.xml><?xml version="1.0" encoding="utf-8"?>
+<w:settings xmlns:mc="http://schemas.openxmlformats.org/markup-compatibility/2006" xmlns:o="urn:schemas-microsoft-com:office:office" xmlns:r="http://schemas.openxmlformats.org/officeDocument/2006/relationships" xmlns:m="http://schemas.openxmlformats.org/officeDocument/2006/math" xmlns:v="urn:schemas-microsoft-com:vml" xmlns:w10="urn:schemas-microsoft-com:office:word" xmlns:w="http://schemas.openxmlformats.org/wordprocessingml/2006/main" xmlns:w14="http://schemas.microsoft.com/office/word/2010/wordml" xmlns:w15="http://schemas.microsoft.com/office/word/2012/wordml" xmlns:w16se="http://schemas.microsoft.com/office/word/2015/wordml/symex" xmlns:sl="http://schemas.openxmlformats.org/schemaLibrary/2006/main" mc:Ignorable="w14 w15 w16se">
+  <w:view w:val="normal"/>
+  <w:defaultTabStop w:val="720"/>
+  <w:characterSpacingControl w:val="doNotCompress"/>
+  <w:compat>
+    <w:useFELayout/>
+    <w:compatSetting w:name="compatibilityMode" w:uri="http://schemas.microsoft.com/office/word" w:val="15"/>
+    <w:compatSetting w:name="overrideTableStyleFontSizeAndJustification" w:uri="http://schemas.microsoft.com/office/word" w:val="1"/>
+    <w:compatSetting w:name="enableOpenTypeFeatures" w:uri="http://schemas.microsoft.com/office/word" w:val="1"/>
+    <w:compatSetting w:name="doNotFlipMirrorIndents" w:uri="http://schemas.microsoft.com/office/word" w:val="1"/>
+    <w:compatSetting w:name="differentiateMultirowTableHeaders" w:uri="http://schemas.microsoft.com/office/word" w:val="1"/>
+  </w:compat>
+  <w:rsids>
+    <w:rsidRoot w:val="00B308CE"/>
+    <w:rsid w:val="00B308CE"/>
+    <w:rsid w:val="00C92E93"/>
+  </w:rsids>
+  <m:mathPr>
+    <m:mathFont m:val="Cambria Math"/>
+    <m:brkBin m:val="before"/>
+    <m:brkBinSub m:val="--"/>
+    <m:smallFrac m:val="0"/>
+    <m:dispDef/>
+    <m:lMargin m:val="0"/>
+    <m:rMargin m:val="0"/>
+    <m:defJc m:val="centerGroup"/>
+    <m:wrapIndent m:val="1440"/>
+    <m:intLim m:val="subSup"/>
+    <m:naryLim m:val="undOvr"/>
+  </m:mathPr>
+  <w:themeFontLang w:val="en-US"/>
+  <w:clrSchemeMapping w:bg1="light1" w:t1="dark1" w:bg2="light2" w:t2="dark2" w:accent1="accent1" w:accent2="accent2" w:accent3="accent3" w:accent4="accent4" w:accent5="accent5" w:accent6="accent6" w:hyperlink="hyperlink" w:followedHyperlink="followedHyperlink"/>
+  <w:decimalSymbol w:val="."/>
+  <w:listSeparator w:val=","/>
+  <w15:chartTrackingRefBased/>
+</w:settings>
+</file>
+
+<file path=word/glossary/styles.xml><?xml version="1.0" encoding="utf-8"?>
+<w:styles xmlns:mc="http://schemas.openxmlformats.org/markup-compatibility/2006" xmlns:r="http://schemas.openxmlformats.org/officeDocument/2006/relationships" xmlns:w="http://schemas.openxmlformats.org/wordprocessingml/2006/main" xmlns:w14="http://schemas.microsoft.com/office/word/2010/wordml" xmlns:w15="http://schemas.microsoft.com/office/word/2012/wordml" xmlns:w16se="http://schemas.microsoft.com/office/word/2015/wordml/symex" mc:Ignorable="w14 w15 w16se">
+  <w:docDefaults>
+    <w:rPrDefault>
+      <w:rPr>
+        <w:rFonts w:asciiTheme="minorHAnsi" w:eastAsiaTheme="minorEastAsia" w:hAnsiTheme="minorHAnsi" w:cstheme="minorBidi"/>
+        <w:sz w:val="22"/>
+        <w:szCs w:val="22"/>
+        <w:lang w:val="en-US" w:eastAsia="en-US" w:bidi="ar-SA"/>
+      </w:rPr>
+    </w:rPrDefault>
+    <w:pPrDefault>
+      <w:pPr>
+        <w:spacing w:after="160" w:line="259" w:lineRule="auto"/>
+      </w:pPr>
+    </w:pPrDefault>
+  </w:docDefaults>
+  <w:latentStyles w:defLockedState="0" w:defUIPriority="99" w:defSemiHidden="0" w:defUnhideWhenUsed="0" w:defQFormat="0" w:count="371">
+    <w:lsdException w:name="Normal" w:uiPriority="0" w:qFormat="1"/>
+    <w:lsdException w:name="heading 1" w:uiPriority="9" w:qFormat="1"/>
+    <w:lsdException w:name="heading 2" w:semiHidden="1" w:uiPriority="9" w:unhideWhenUsed="1" w:qFormat="1"/>
+    <w:lsdException w:name="heading 3" w:semiHidden="1" w:uiPriority="9" w:unhideWhenUsed="1" w:qFormat="1"/>
+    <w:lsdException w:name="heading 4" w:semiHidden="1" w:uiPriority="9" w:unhideWhenUsed="1" w:qFormat="1"/>
+    <w:lsdException w:name="heading 5" w:semiHidden="1" w:uiPriority="9" w:unhideWhenUsed="1" w:qFormat="1"/>
+    <w:lsdException w:name="heading 6" w:semiHidden="1" w:uiPriority="9" w:unhideWhenUsed="1" w:qFormat="1"/>
+    <w:lsdException w:name="heading 7" w:semiHidden="1" w:uiPriority="9" w:unhideWhenUsed="1" w:qFormat="1"/>
+    <w:lsdException w:name="heading 8" w:semiHidden="1" w:uiPriority="9" w:unhideWhenUsed="1" w:qFormat="1"/>
+    <w:lsdException w:name="heading 9" w:semiHidden="1" w:uiPriority="9" w:unhideWhenUsed="1" w:qFormat="1"/>
+    <w:lsdException w:name="index 1" w:semiHidden="1" w:unhideWhenUsed="1"/>
+    <w:lsdException w:name="index 2" w:semiHidden="1" w:unhideWhenUsed="1"/>
+    <w:lsdException w:name="index 3" w:semiHidden="1" w:unhideWhenUsed="1"/>
+    <w:lsdException w:name="index 4" w:semiHidden="1" w:unhideWhenUsed="1"/>
+    <w:lsdException w:name="index 5" w:semiHidden="1" w:unhideWhenUsed="1"/>
+    <w:lsdException w:name="index 6" w:semiHidden="1" w:unhideWhenUsed="1"/>
+    <w:lsdException w:name="index 7" w:semiHidden="1" w:unhideWhenUsed="1"/>
+    <w:lsdException w:name="index 8" w:semiHidden="1" w:unhideWhenUsed="1"/>
+    <w:lsdException w:name="index 9" w:semiHidden="1" w:unhideWhenUsed="1"/>
+    <w:lsdException w:name="toc 1" w:semiHidden="1" w:uiPriority="39" w:unhideWhenUsed="1"/>
+    <w:lsdException w:name="toc 2" w:semiHidden="1" w:uiPriority="39" w:unhideWhenUsed="1"/>
+    <w:lsdException w:name="toc 3" w:semiHidden="1" w:uiPriority="39" w:unhideWhenUsed="1"/>
+    <w:lsdException w:name="toc 4" w:semiHidden="1" w:uiPriority="39" w:unhideWhenUsed="1"/>
+    <w:lsdException w:name="toc 5" w:semiHidden="1" w:uiPriority="39" w:unhideWhenUsed="1"/>
+    <w:lsdException w:name="toc 6" w:semiHidden="1" w:uiPriority="39" w:unhideWhenUsed="1"/>
+    <w:lsdException w:name="toc 7" w:semiHidden="1" w:uiPriority="39" w:unhideWhenUsed="1"/>
+    <w:lsdException w:name="toc 8" w:semiHidden="1" w:uiPriority="39" w:unhideWhenUsed="1"/>
+    <w:lsdException w:name="toc 9" w:semiHidden="1" w:uiPriority="39" w:unhideWhenUsed="1"/>
+    <w:lsdException w:name="Normal Indent" w:semiHidden="1" w:unhideWhenUsed="1"/>
+    <w:lsdException w:name="footnote text" w:semiHidden="1" w:unhideWhenUsed="1"/>
+    <w:lsdException w:name="annotation text" w:semiHidden="1" w:unhideWhenUsed="1"/>
+    <w:lsdException w:name="header" w:semiHidden="1" w:unhideWhenUsed="1"/>
+    <w:lsdException w:name="footer" w:semiHidden="1" w:unhideWhenUsed="1"/>
+    <w:lsdException w:name="index heading" w:semiHidden="1" w:unhideWhenUsed="1"/>
+    <w:lsdException w:name="caption" w:semiHidden="1" w:uiPriority="35" w:unhideWhenUsed="1" w:qFormat="1"/>
+    <w:lsdException w:name="table of figures" w:semiHidden="1" w:unhideWhenUsed="1"/>
+    <w:lsdException w:name="envelope address" w:semiHidden="1" w:unhideWhenUsed="1"/>
+    <w:lsdException w:name="envelope return" w:semiHidden="1" w:unhideWhenUsed="1"/>
+    <w:lsdException w:name="footnote reference" w:semiHidden="1" w:unhideWhenUsed="1"/>
+    <w:lsdException w:name="annotation reference" w:semiHidden="1" w:unhideWhenUsed="1"/>
+    <w:lsdException w:name="line number" w:semiHidden="1" w:unhideWhenUsed="1"/>
+    <w:lsdException w:name="page number" w:semiHidden="1" w:unhideWhenUsed="1"/>
+    <w:lsdException w:name="endnote reference" w:semiHidden="1" w:unhideWhenUsed="1"/>
+    <w:lsdException w:name="endnote text" w:semiHidden="1" w:unhideWhenUsed="1"/>
+    <w:lsdException w:name="table of authorities" w:semiHidden="1" w:unhideWhenUsed="1"/>
+    <w:lsdException w:name="macro" w:semiHidden="1" w:unhideWhenUsed="1"/>
+    <w:lsdException w:name="toa heading" w:semiHidden="1" w:unhideWhenUsed="1"/>
+    <w:lsdException w:name="List" w:semiHidden="1" w:unhideWhenUsed="1"/>
+    <w:lsdException w:name="List Bullet" w:semiHidden="1" w:unhideWhenUsed="1"/>
+    <w:lsdException w:name="List Number" w:semiHidden="1" w:unhideWhenUsed="1"/>
+    <w:lsdException w:name="List 2" w:semiHidden="1" w:unhideWhenUsed="1"/>
+    <w:lsdException w:name="List 3" w:semiHidden="1" w:unhideWhenUsed="1"/>
+    <w:lsdException w:name="List 4" w:semiHidden="1" w:unhideWhenUsed="1"/>
+    <w:lsdException w:name="List 5" w:semiHidden="1" w:unhideWhenUsed="1"/>
+    <w:lsdException w:name="List Bullet 2" w:semiHidden="1" w:unhideWhenUsed="1"/>
+    <w:lsdException w:name="List Bullet 3" w:semiHidden="1" w:unhideWhenUsed="1"/>
+    <w:lsdException w:name="List Bullet 4" w:semiHidden="1" w:unhideWhenUsed="1"/>
+    <w:lsdException w:name="List Bullet 5" w:semiHidden="1" w:unhideWhenUsed="1"/>
+    <w:lsdException w:name="List Number 2" w:semiHidden="1" w:unhideWhenUsed="1"/>
+    <w:lsdException w:name="List Number 3" w:semiHidden="1" w:unhideWhenUsed="1"/>
+    <w:lsdException w:name="List Number 4" w:semiHidden="1" w:unhideWhenUsed="1"/>
+    <w:lsdException w:name="List Number 5" w:semiHidden="1" w:unhideWhenUsed="1"/>
+    <w:lsdException w:name="Title" w:uiPriority="10" w:qFormat="1"/>
+    <w:lsdException w:name="Closing" w:semiHidden="1" w:unhideWhenUsed="1"/>
+    <w:lsdException w:name="Signature" w:semiHidden="1" w:unhideWhenUsed="1"/>
+    <w:lsdException w:name="Default Paragraph Font" w:semiHidden="1" w:uiPriority="1" w:unhideWhenUsed="1"/>
+    <w:lsdException w:name="Body Text" w:semiHidden="1" w:unhideWhenUsed="1"/>
+    <w:lsdException w:name="Body Text Indent" w:semiHidden="1" w:unhideWhenUsed="1"/>
+    <w:lsdException w:name="List Continue" w:semiHidden="1" w:unhideWhenUsed="1"/>
+    <w:lsdException w:name="List Continue 2" w:semiHidden="1" w:unhideWhenUsed="1"/>
+    <w:lsdException w:name="List Continue 3" w:semiHidden="1" w:unhideWhenUsed="1"/>
+    <w:lsdException w:name="List Continue 4" w:semiHidden="1" w:unhideWhenUsed="1"/>
+    <w:lsdException w:name="List Continue 5" w:semiHidden="1" w:unhideWhenUsed="1"/>
+    <w:lsdException w:name="Message Header" w:semiHidden="1" w:unhideWhenUsed="1"/>
+    <w:lsdException w:name="Subtitle" w:uiPriority="11" w:qFormat="1"/>
+    <w:lsdException w:name="Salutation" w:semiHidden="1" w:unhideWhenUsed="1"/>
+    <w:lsdException w:name="Date" w:semiHidden="1" w:unhideWhenUsed="1"/>
+    <w:lsdException w:name="Body Text First Indent" w:semiHidden="1" w:unhideWhenUsed="1"/>
+    <w:lsdException w:name="Body Text First Indent 2" w:semiHidden="1" w:unhideWhenUsed="1"/>
+    <w:lsdException w:name="Note Heading" w:semiHidden="1" w:unhideWhenUsed="1"/>
+    <w:lsdException w:name="Body Text 2" w:semiHidden="1" w:unhideWhenUsed="1"/>
+    <w:lsdException w:name="Body Text 3" w:semiHidden="1" w:unhideWhenUsed="1"/>
+    <w:lsdException w:name="Body Text Indent 2" w:semiHidden="1" w:unhideWhenUsed="1"/>
+    <w:lsdException w:name="Body Text Indent 3" w:semiHidden="1" w:unhideWhenUsed="1"/>
+    <w:lsdException w:name="Block Text" w:semiHidden="1" w:unhideWhenUsed="1"/>
+    <w:lsdException w:name="Hyperlink" w:semiHidden="1" w:unhideWhenUsed="1"/>
+    <w:lsdException w:name="FollowedHyperlink" w:semiHidden="1" w:unhideWhenUsed="1"/>
+    <w:lsdException w:name="Strong" w:uiPriority="22" w:qFormat="1"/>
+    <w:lsdException w:name="Emphasis" w:uiPriority="20" w:qFormat="1"/>
+    <w:lsdException w:name="Document Map" w:semiHidden="1" w:unhideWhenUsed="1"/>
+    <w:lsdException w:name="Plain Text" w:semiHidden="1" w:unhideWhenUsed="1"/>
+    <w:lsdException w:name="E-mail Signature" w:semiHidden="1" w:unhideWhenUsed="1"/>
+    <w:lsdException w:name="HTML Top of Form" w:semiHidden="1" w:unhideWhenUsed="1"/>
+    <w:lsdException w:name="HTML Bottom of Form" w:semiHidden="1" w:unhideWhenUsed="1"/>
+    <w:lsdException w:name="Normal (Web)" w:semiHidden="1" w:unhideWhenUsed="1"/>
+    <w:lsdException w:name="HTML Acronym" w:semiHidden="1" w:unhideWhenUsed="1"/>
+    <w:lsdException w:name="HTML Address" w:semiHidden="1" w:unhideWhenUsed="1"/>
+    <w:lsdException w:name="HTML Cite" w:semiHidden="1" w:unhideWhenUsed="1"/>
+    <w:lsdException w:name="HTML Code" w:semiHidden="1" w:unhideWhenUsed="1"/>
+    <w:lsdException w:name="HTML Definition" w:semiHidden="1" w:unhideWhenUsed="1"/>
+    <w:lsdException w:name="HTML Keyboard" w:semiHidden="1" w:unhideWhenUsed="1"/>
+    <w:lsdException w:name="HTML Preformatted" w:semiHidden="1" w:unhideWhenUsed="1"/>
+    <w:lsdException w:name="HTML Sample" w:semiHidden="1" w:unhideWhenUsed="1"/>
+    <w:lsdException w:name="HTML Typewriter" w:semiHidden="1" w:unhideWhenUsed="1"/>
+    <w:lsdException w:name="HTML Variable" w:semiHidden="1" w:unhideWhenUsed="1"/>
+    <w:lsdException w:name="Normal Table" w:semiHidden="1" w:unhideWhenUsed="1"/>
+    <w:lsdException w:name="annotation subject" w:semiHidden="1" w:unhideWhenUsed="1"/>
+    <w:lsdException w:name="No List" w:semiHidden="1" w:unhideWhenUsed="1"/>
+    <w:lsdException w:name="Outline List 1" w:semiHidden="1" w:unhideWhenUsed="1"/>
+    <w:lsdException w:name="Outline List 2" w:semiHidden="1" w:unhideWhenUsed="1"/>
+    <w:lsdException w:name="Outline List 3" w:semiHidden="1" w:unhideWhenUsed="1"/>
+    <w:lsdException w:name="Table Simple 1" w:semiHidden="1" w:unhideWhenUsed="1"/>
+    <w:lsdException w:name="Table Simple 2" w:semiHidden="1" w:unhideWhenUsed="1"/>
+    <w:lsdException w:name="Table Simple 3" w:semiHidden="1" w:unhideWhenUsed="1"/>
+    <w:lsdException w:name="Table Classic 1" w:semiHidden="1" w:unhideWhenUsed="1"/>
+    <w:lsdException w:name="Table Classic 2" w:semiHidden="1" w:unhideWhenUsed="1"/>
+    <w:lsdException w:name="Table Classic 3" w:semiHidden="1" w:unhideWhenUsed="1"/>
+    <w:lsdException w:name="Table Classic 4" w:semiHidden="1" w:unhideWhenUsed="1"/>
+    <w:lsdException w:name="Table Colorful 1" w:semiHidden="1" w:unhideWhenUsed="1"/>
+    <w:lsdException w:name="Table Colorful 2" w:semiHidden="1" w:unhideWhenUsed="1"/>
+    <w:lsdException w:name="Table Colorful 3" w:semiHidden="1" w:unhideWhenUsed="1"/>
+    <w:lsdException w:name="Table Columns 1" w:semiHidden="1" w:unhideWhenUsed="1"/>
+    <w:lsdException w:name="Table Columns 2" w:semiHidden="1" w:unhideWhenUsed="1"/>
+    <w:lsdException w:name="Table Columns 3" w:semiHidden="1" w:unhideWhenUsed="1"/>
+    <w:lsdException w:name="Table Columns 4" w:semiHidden="1" w:unhideWhenUsed="1"/>
+    <w:lsdException w:name="Table Columns 5" w:semiHidden="1" w:unhideWhenUsed="1"/>
+    <w:lsdException w:name="Table Grid 1" w:semiHidden="1" w:unhideWhenUsed="1"/>
+    <w:lsdException w:name="Table Grid 2" w:semiHidden="1" w:unhideWhenUsed="1"/>
+    <w:lsdException w:name="Table Grid 3" w:semiHidden="1" w:unhideWhenUsed="1"/>
+    <w:lsdException w:name="Table Grid 4" w:semiHidden="1" w:unhideWhenUsed="1"/>
+    <w:lsdException w:name="Table Grid 5" w:semiHidden="1" w:unhideWhenUsed="1"/>
+    <w:lsdException w:name="Table Grid 6" w:semiHidden="1" w:unhideWhenUsed="1"/>
+    <w:lsdException w:name="Table Grid 7" w:semiHidden="1" w:unhideWhenUsed="1"/>
+    <w:lsdException w:name="Table Grid 8" w:semiHidden="1" w:unhideWhenUsed="1"/>
+    <w:lsdException w:name="Table List 1" w:semiHidden="1" w:unhideWhenUsed="1"/>
+    <w:lsdException w:name="Table List 2" w:semiHidden="1" w:unhideWhenUsed="1"/>
+    <w:lsdException w:name="Table List 3" w:semiHidden="1" w:unhideWhenUsed="1"/>
+    <w:lsdException w:name="Table List 4" w:semiHidden="1" w:unhideWhenUsed="1"/>
+    <w:lsdException w:name="Table List 5" w:semiHidden="1" w:unhideWhenUsed="1"/>
+    <w:lsdException w:name="Table List 6" w:semiHidden="1" w:unhideWhenUsed="1"/>
+    <w:lsdException w:name="Table List 7" w:semiHidden="1" w:unhideWhenUsed="1"/>
+    <w:lsdException w:name="Table List 8" w:semiHidden="1" w:unhideWhenUsed="1"/>
+    <w:lsdException w:name="Table 3D effects 1" w:semiHidden="1" w:unhideWhenUsed="1"/>
+    <w:lsdException w:name="Table 3D effects 2" w:semiHidden="1" w:unhideWhenUsed="1"/>
+    <w:lsdException w:name="Table 3D effects 3" w:semiHidden="1" w:unhideWhenUsed="1"/>
+    <w:lsdException w:name="Table Contemporary" w:semiHidden="1" w:unhideWhenUsed="1"/>
+    <w:lsdException w:name="Table Elegant" w:semiHidden="1" w:unhideWhenUsed="1"/>
+    <w:lsdException w:name="Table Professional" w:semiHidden="1" w:unhideWhenUsed="1"/>
+    <w:lsdException w:name="Table Subtle 1" w:semiHidden="1" w:unhideWhenUsed="1"/>
+    <w:lsdException w:name="Table Subtle 2" w:semiHidden="1" w:unhideWhenUsed="1"/>
+    <w:lsdException w:name="Table Web 1" w:semiHidden="1" w:unhideWhenUsed="1"/>
+    <w:lsdException w:name="Table Web 2" w:semiHidden="1" w:unhideWhenUsed="1"/>
+    <w:lsdException w:name="Table Web 3" w:semiHidden="1" w:unhideWhenUsed="1"/>
+    <w:lsdException w:name="Balloon Text" w:semiHidden="1" w:unhideWhenUsed="1"/>
+    <w:lsdException w:name="Table Grid" w:uiPriority="39"/>
+    <w:lsdException w:name="Table Theme" w:semiHidden="1" w:unhideWhenUsed="1"/>
+    <w:lsdException w:name="Placeholder Text" w:semiHidden="1"/>
+    <w:lsdException w:name="No Spacing" w:uiPriority="1" w:qFormat="1"/>
+    <w:lsdException w:name="Light Shading" w:uiPriority="60"/>
+    <w:lsdException w:name="Light List" w:uiPriority="61"/>
+    <w:lsdException w:name="Light Grid" w:uiPriority="62"/>
+    <w:lsdException w:name="Medium Shading 1" w:uiPriority="63"/>
+    <w:lsdException w:name="Medium Shading 2" w:uiPriority="64"/>
+    <w:lsdException w:name="Medium List 1" w:uiPriority="65"/>
+    <w:lsdException w:name="Medium List 2" w:uiPriority="66"/>
+    <w:lsdException w:name="Medium Grid 1" w:uiPriority="67"/>
+    <w:lsdException w:name="Medium Grid 2" w:uiPriority="68"/>
+    <w:lsdException w:name="Medium Grid 3" w:uiPriority="69"/>
+    <w:lsdException w:name="Dark List" w:uiPriority="70"/>
+    <w:lsdException w:name="Colorful Shading" w:uiPriority="71"/>
+    <w:lsdException w:name="Colorful List" w:uiPriority="72"/>
+    <w:lsdException w:name="Colorful Grid" w:uiPriority="73"/>
+    <w:lsdException w:name="Light Shading Accent 1" w:uiPriority="60"/>
+    <w:lsdException w:name="Light List Accent 1" w:uiPriority="61"/>
+    <w:lsdException w:name="Light Grid Accent 1" w:uiPriority="62"/>
+    <w:lsdException w:name="Medium Shading 1 Accent 1" w:uiPriority="63"/>
+    <w:lsdException w:name="Medium Shading 2 Accent 1" w:uiPriority="64"/>
+    <w:lsdException w:name="Medium List 1 Accent 1" w:uiPriority="65"/>
+    <w:lsdException w:name="Revision" w:semiHidden="1"/>
+    <w:lsdException w:name="List Paragraph" w:uiPriority="34" w:qFormat="1"/>
+    <w:lsdException w:name="Quote" w:uiPriority="29" w:qFormat="1"/>
+    <w:lsdException w:name="Intense Quote" w:uiPriority="30" w:qFormat="1"/>
+    <w:lsdException w:name="Medium List 2 Accent 1" w:uiPriority="66"/>
+    <w:lsdException w:name="Medium Grid 1 Accent 1" w:uiPriority="67"/>
+    <w:lsdException w:name="Medium Grid 2 Accent 1" w:uiPriority="68"/>
+    <w:lsdException w:name="Medium Grid 3 Accent 1" w:uiPriority="69"/>
+    <w:lsdException w:name="Dark List Accent 1" w:uiPriority="70"/>
+    <w:lsdException w:name="Colorful Shading Accent 1" w:uiPriority="71"/>
+    <w:lsdException w:name="Colorful List Accent 1" w:uiPriority="72"/>
+    <w:lsdException w:name="Colorful Grid Accent 1" w:uiPriority="73"/>
+    <w:lsdException w:name="Light Shading Accent 2" w:uiPriority="60"/>
+    <w:lsdException w:name="Light List Accent 2" w:uiPriority="61"/>
+    <w:lsdException w:name="Light Grid Accent 2" w:uiPriority="62"/>
+    <w:lsdException w:name="Medium Shading 1 Accent 2" w:uiPriority="63"/>
+    <w:lsdException w:name="Medium Shading 2 Accent 2" w:uiPriority="64"/>
+    <w:lsdException w:name="Medium List 1 Accent 2" w:uiPriority="65"/>
+    <w:lsdException w:name="Medium List 2 Accent 2" w:uiPriority="66"/>
+    <w:lsdException w:name="Medium Grid 1 Accent 2" w:uiPriority="67"/>
+    <w:lsdException w:name="Medium Grid 2 Accent 2" w:uiPriority="68"/>
+    <w:lsdException w:name="Medium Grid 3 Accent 2" w:uiPriority="69"/>
+    <w:lsdException w:name="Dark List Accent 2" w:uiPriority="70"/>
+    <w:lsdException w:name="Colorful Shading Accent 2" w:uiPriority="71"/>
+    <w:lsdException w:name="Colorful List Accent 2" w:uiPriority="72"/>
+    <w:lsdException w:name="Colorful Grid Accent 2" w:uiPriority="73"/>
+    <w:lsdException w:name="Light Shading Accent 3" w:uiPriority="60"/>
+    <w:lsdException w:name="Light List Accent 3" w:uiPriority="61"/>
+    <w:lsdException w:name="Light Grid Accent 3" w:uiPriority="62"/>
+    <w:lsdException w:name="Medium Shading 1 Accent 3" w:uiPriority="63"/>
+    <w:lsdException w:name="Medium Shading 2 Accent 3" w:uiPriority="64"/>
+    <w:lsdException w:name="Medium List 1 Accent 3" w:uiPriority="65"/>
+    <w:lsdException w:name="Medium List 2 Accent 3" w:uiPriority="66"/>
+    <w:lsdException w:name="Medium Grid 1 Accent 3" w:uiPriority="67"/>
+    <w:lsdException w:name="Medium Grid 2 Accent 3" w:uiPriority="68"/>
+    <w:lsdException w:name="Medium Grid 3 Accent 3" w:uiPriority="69"/>
+    <w:lsdException w:name="Dark List Accent 3" w:uiPriority="70"/>
+    <w:lsdException w:name="Colorful Shading Accent 3" w:uiPriority="71"/>
+    <w:lsdException w:name="Colorful List Accent 3" w:uiPriority="72"/>
+    <w:lsdException w:name="Colorful Grid Accent 3" w:uiPriority="73"/>
+    <w:lsdException w:name="Light Shading Accent 4" w:uiPriority="60"/>
+    <w:lsdException w:name="Light List Accent 4" w:uiPriority="61"/>
+    <w:lsdException w:name="Light Grid Accent 4" w:uiPriority="62"/>
+    <w:lsdException w:name="Medium Shading 1 Accent 4" w:uiPriority="63"/>
+    <w:lsdException w:name="Medium Shading 2 Accent 4" w:uiPriority="64"/>
+    <w:lsdException w:name="Medium List 1 Accent 4" w:uiPriority="65"/>
+    <w:lsdException w:name="Medium List 2 Accent 4" w:uiPriority="66"/>
+    <w:lsdException w:name="Medium Grid 1 Accent 4" w:uiPriority="67"/>
+    <w:lsdException w:name="Medium Grid 2 Accent 4" w:uiPriority="68"/>
+    <w:lsdException w:name="Medium Grid 3 Accent 4" w:uiPriority="69"/>
+    <w:lsdException w:name="Dark List Accent 4" w:uiPriority="70"/>
+    <w:lsdException w:name="Colorful Shading Accent 4" w:uiPriority="71"/>
+    <w:lsdException w:name="Colorful List Accent 4" w:uiPriority="72"/>
+    <w:lsdException w:name="Colorful Grid Accent 4" w:uiPriority="73"/>
+    <w:lsdException w:name="Light Shading Accent 5" w:uiPriority="60"/>
+    <w:lsdException w:name="Light List Accent 5" w:uiPriority="61"/>
+    <w:lsdException w:name="Light Grid Accent 5" w:uiPriority="62"/>
+    <w:lsdException w:name="Medium Shading 1 Accent 5" w:uiPriority="63"/>
+    <w:lsdException w:name="Medium Shading 2 Accent 5" w:uiPriority="64"/>
+    <w:lsdException w:name="Medium List 1 Accent 5" w:uiPriority="65"/>
+    <w:lsdException w:name="Medium List 2 Accent 5" w:uiPriority="66"/>
+    <w:lsdException w:name="Medium Grid 1 Accent 5" w:uiPriority="67"/>
+    <w:lsdException w:name="Medium Grid 2 Accent 5" w:uiPriority="68"/>
+    <w:lsdException w:name="Medium Grid 3 Accent 5" w:uiPriority="69"/>
+    <w:lsdException w:name="Dark List Accent 5" w:uiPriority="70"/>
+    <w:lsdException w:name="Colorful Shading Accent 5" w:uiPriority="71"/>
+    <w:lsdException w:name="Colorful List Accent 5" w:uiPriority="72"/>
+    <w:lsdException w:name="Colorful Grid Accent 5" w:uiPriority="73"/>
+    <w:lsdException w:name="Light Shading Accent 6" w:uiPriority="60"/>
+    <w:lsdException w:name="Light List Accent 6" w:uiPriority="61"/>
+    <w:lsdException w:name="Light Grid Accent 6" w:uiPriority="62"/>
+    <w:lsdException w:name="Medium Shading 1 Accent 6" w:uiPriority="63"/>
+    <w:lsdException w:name="Medium Shading 2 Accent 6" w:uiPriority="64"/>
+    <w:lsdException w:name="Medium List 1 Accent 6" w:uiPriority="65"/>
+    <w:lsdException w:name="Medium List 2 Accent 6" w:uiPriority="66"/>
+    <w:lsdException w:name="Medium Grid 1 Accent 6" w:uiPriority="67"/>
+    <w:lsdException w:name="Medium Grid 2 Accent 6" w:uiPriority="68"/>
+    <w:lsdException w:name="Medium Grid 3 Accent 6" w:uiPriority="69"/>
+    <w:lsdException w:name="Dark List Accent 6" w:uiPriority="70"/>
+    <w:lsdException w:name="Colorful Shading Accent 6" w:uiPriority="71"/>
+    <w:lsdException w:name="Colorful List Accent 6" w:uiPriority="72"/>
+    <w:lsdException w:name="Colorful Grid Accent 6" w:uiPriority="73"/>
+    <w:lsdException w:name="Subtle Emphasis" w:uiPriority="19" w:qFormat="1"/>
+    <w:lsdException w:name="Intense Emphasis" w:uiPriority="21" w:qFormat="1"/>
+    <w:lsdException w:name="Subtle Reference" w:uiPriority="31" w:qFormat="1"/>
+    <w:lsdException w:name="Intense Reference" w:uiPriority="32" w:qFormat="1"/>
+    <w:lsdException w:name="Book Title" w:uiPriority="33" w:qFormat="1"/>
+    <w:lsdException w:name="Bibliography" w:semiHidden="1" w:uiPriority="37" w:unhideWhenUsed="1"/>
+    <w:lsdException w:name="TOC Heading" w:semiHidden="1" w:uiPriority="39" w:unhideWhenUsed="1" w:qFormat="1"/>
+    <w:lsdException w:name="Plain Table 1" w:uiPriority="41"/>
+    <w:lsdException w:name="Plain Table 2" w:uiPriority="42"/>
+    <w:lsdException w:name="Plain Table 3" w:uiPriority="43"/>
+    <w:lsdException w:name="Plain Table 4" w:uiPriority="44"/>
+    <w:lsdException w:name="Plain Table 5" w:uiPriority="45"/>
+    <w:lsdException w:name="Grid Table Light" w:uiPriority="40"/>
+    <w:lsdException w:name="Grid Table 1 Light" w:uiPriority="46"/>
+    <w:lsdException w:name="Grid Table 2" w:uiPriority="47"/>
+    <w:lsdException w:name="Grid Table 3" w:uiPriority="48"/>
+    <w:lsdException w:name="Grid Table 4" w:uiPriority="49"/>
+    <w:lsdException w:name="Grid Table 5 Dark" w:uiPriority="50"/>
+    <w:lsdException w:name="Grid Table 6 Colorful" w:uiPriority="51"/>
+    <w:lsdException w:name="Grid Table 7 Colorful" w:uiPriority="52"/>
+    <w:lsdException w:name="Grid Table 1 Light Accent 1" w:uiPriority="46"/>
+    <w:lsdException w:name="Grid Table 2 Accent 1" w:uiPriority="47"/>
+    <w:lsdException w:name="Grid Table 3 Accent 1" w:uiPriority="48"/>
+    <w:lsdException w:name="Grid Table 4 Accent 1" w:uiPriority="49"/>
+    <w:lsdException w:name="Grid Table 5 Dark Accent 1" w:uiPriority="50"/>
+    <w:lsdException w:name="Grid Table 6 Colorful Accent 1" w:uiPriority="51"/>
+    <w:lsdException w:name="Grid Table 7 Colorful Accent 1" w:uiPriority="52"/>
+    <w:lsdException w:name="Grid Table 1 Light Accent 2" w:uiPriority="46"/>
+    <w:lsdException w:name="Grid Table 2 Accent 2" w:uiPriority="47"/>
+    <w:lsdException w:name="Grid Table 3 Accent 2" w:uiPriority="48"/>
+    <w:lsdException w:name="Grid Table 4 Accent 2" w:uiPriority="49"/>
+    <w:lsdException w:name="Grid Table 5 Dark Accent 2" w:uiPriority="50"/>
+    <w:lsdException w:name="Grid Table 6 Colorful Accent 2" w:uiPriority="51"/>
+    <w:lsdException w:name="Grid Table 7 Colorful Accent 2" w:uiPriority="52"/>
+    <w:lsdException w:name="Grid Table 1 Light Accent 3" w:uiPriority="46"/>
+    <w:lsdException w:name="Grid Table 2 Accent 3" w:uiPriority="47"/>
+    <w:lsdException w:name="Grid Table 3 Accent 3" w:uiPriority="48"/>
+    <w:lsdException w:name="Grid Table 4 Accent 3" w:uiPriority="49"/>
+    <w:lsdException w:name="Grid Table 5 Dark Accent 3" w:uiPriority="50"/>
+    <w:lsdException w:name="Grid Table 6 Colorful Accent 3" w:uiPriority="51"/>
+    <w:lsdException w:name="Grid Table 7 Colorful Accent 3" w:uiPriority="52"/>
+    <w:lsdException w:name="Grid Table 1 Light Accent 4" w:uiPriority="46"/>
+    <w:lsdException w:name="Grid Table 2 Accent 4" w:uiPriority="47"/>
+    <w:lsdException w:name="Grid Table 3 Accent 4" w:uiPriority="48"/>
+    <w:lsdException w:name="Grid Table 4 Accent 4" w:uiPriority="49"/>
+    <w:lsdException w:name="Grid Table 5 Dark Accent 4" w:uiPriority="50"/>
+    <w:lsdException w:name="Grid Table 6 Colorful Accent 4" w:uiPriority="51"/>
+    <w:lsdException w:name="Grid Table 7 Colorful Accent 4" w:uiPriority="52"/>
+    <w:lsdException w:name="Grid Table 1 Light Accent 5" w:uiPriority="46"/>
+    <w:lsdException w:name="Grid Table 2 Accent 5" w:uiPriority="47"/>
+    <w:lsdException w:name="Grid Table 3 Accent 5" w:uiPriority="48"/>
+    <w:lsdException w:name="Grid Table 4 Accent 5" w:uiPriority="49"/>
+    <w:lsdException w:name="Grid Table 5 Dark Accent 5" w:uiPriority="50"/>
+    <w:lsdException w:name="Grid Table 6 Colorful Accent 5" w:uiPriority="51"/>
+    <w:lsdException w:name="Grid Table 7 Colorful Accent 5" w:uiPriority="52"/>
+    <w:lsdException w:name="Grid Table 1 Light Accent 6" w:uiPriority="46"/>
+    <w:lsdException w:name="Grid Table 2 Accent 6" w:uiPriority="47"/>
+    <w:lsdException w:name="Grid Table 3 Accent 6" w:uiPriority="48"/>
+    <w:lsdException w:name="Grid Table 4 Accent 6" w:uiPriority="49"/>
+    <w:lsdException w:name="Grid Table 5 Dark Accent 6" w:uiPriority="50"/>
+    <w:lsdException w:name="Grid Table 6 Colorful Accent 6" w:uiPriority="51"/>
+    <w:lsdException w:name="Grid Table 7 Colorful Accent 6" w:uiPriority="52"/>
+    <w:lsdException w:name="List Table 1 Light" w:uiPriority="46"/>
+    <w:lsdException w:name="List Table 2" w:uiPriority="47"/>
+    <w:lsdException w:name="List Table 3" w:uiPriority="48"/>
+    <w:lsdException w:name="List Table 4" w:uiPriority="49"/>
+    <w:lsdException w:name="List Table 5 Dark" w:uiPriority="50"/>
+    <w:lsdException w:name="List Table 6 Colorful" w:uiPriority="51"/>
+    <w:lsdException w:name="List Table 7 Colorful" w:uiPriority="52"/>
+    <w:lsdException w:name="List Table 1 Light Accent 1" w:uiPriority="46"/>
+    <w:lsdException w:name="List Table 2 Accent 1" w:uiPriority="47"/>
+    <w:lsdException w:name="List Table 3 Accent 1" w:uiPriority="48"/>
+    <w:lsdException w:name="List Table 4 Accent 1" w:uiPriority="49"/>
+    <w:lsdException w:name="List Table 5 Dark Accent 1" w:uiPriority="50"/>
+    <w:lsdException w:name="List Table 6 Colorful Accent 1" w:uiPriority="51"/>
+    <w:lsdException w:name="List Table 7 Colorful Accent 1" w:uiPriority="52"/>
+    <w:lsdException w:name="List Table 1 Light Accent 2" w:uiPriority="46"/>
+    <w:lsdException w:name="List Table 2 Accent 2" w:uiPriority="47"/>
+    <w:lsdException w:name="List Table 3 Accent 2" w:uiPriority="48"/>
+    <w:lsdException w:name="List Table 4 Accent 2" w:uiPriority="49"/>
+    <w:lsdException w:name="List Table 5 Dark Accent 2" w:uiPriority="50"/>
+    <w:lsdException w:name="List Table 6 Colorful Accent 2" w:uiPriority="51"/>
+    <w:lsdException w:name="List Table 7 Colorful Accent 2" w:uiPriority="52"/>
+    <w:lsdException w:name="List Table 1 Light Accent 3" w:uiPriority="46"/>
+    <w:lsdException w:name="List Table 2 Accent 3" w:uiPriority="47"/>
+    <w:lsdException w:name="List Table 3 Accent 3" w:uiPriority="48"/>
+    <w:lsdException w:name="List Table 4 Accent 3" w:uiPriority="49"/>
+    <w:lsdException w:name="List Table 5 Dark Accent 3" w:uiPriority="50"/>
+    <w:lsdException w:name="List Table 6 Colorful Accent 3" w:uiPriority="51"/>
+    <w:lsdException w:name="List Table 7 Colorful Accent 3" w:uiPriority="52"/>
+    <w:lsdException w:name="List Table 1 Light Accent 4" w:uiPriority="46"/>
+    <w:lsdException w:name="List Table 2 Accent 4" w:uiPriority="47"/>
+    <w:lsdException w:name="List Table 3 Accent 4" w:uiPriority="48"/>
+    <w:lsdException w:name="List Table 4 Accent 4" w:uiPriority="49"/>
+    <w:lsdException w:name="List Table 5 Dark Accent 4" w:uiPriority="50"/>
+    <w:lsdException w:name="List Table 6 Colorful Accent 4" w:uiPriority="51"/>
+    <w:lsdException w:name="List Table 7 Colorful Accent 4" w:uiPriority="52"/>
+    <w:lsdException w:name="List Table 1 Light Accent 5" w:uiPriority="46"/>
+    <w:lsdException w:name="List Table 2 Accent 5" w:uiPriority="47"/>
+    <w:lsdException w:name="List Table 3 Accent 5" w:uiPriority="48"/>
+    <w:lsdException w:name="List Table 4 Accent 5" w:uiPriority="49"/>
+    <w:lsdException w:name="List Table 5 Dark Accent 5" w:uiPriority="50"/>
+    <w:lsdException w:name="List Table 6 Colorful Accent 5" w:uiPriority="51"/>
+    <w:lsdException w:name="List Table 7 Colorful Accent 5" w:uiPriority="52"/>
+    <w:lsdException w:name="List Table 1 Light Accent 6" w:uiPriority="46"/>
+    <w:lsdException w:name="List Table 2 Accent 6" w:uiPriority="47"/>
+    <w:lsdException w:name="List Table 3 Accent 6" w:uiPriority="48"/>
+    <w:lsdException w:name="List Table 4 Accent 6" w:uiPriority="49"/>
+    <w:lsdException w:name="List Table 5 Dark Accent 6" w:uiPriority="50"/>
+    <w:lsdException w:name="List Table 6 Colorful Accent 6" w:uiPriority="51"/>
+    <w:lsdException w:name="List Table 7 Colorful Accent 6" w:uiPriority="52"/>
+  </w:latentStyles>
+  <w:style w:type="paragraph" w:default="1" w:styleId="Normal">
+    <w:name w:val="Normal"/>
+    <w:qFormat/>
+  </w:style>
+  <w:style w:type="character" w:default="1" w:styleId="DefaultParagraphFont">
+    <w:name w:val="Default Paragraph Font"/>
+    <w:uiPriority w:val="1"/>
+    <w:semiHidden/>
+    <w:unhideWhenUsed/>
+  </w:style>
+  <w:style w:type="table" w:default="1" w:styleId="TableNormal">
+    <w:name w:val="Normal Table"/>
+    <w:uiPriority w:val="99"/>
+    <w:semiHidden/>
+    <w:unhideWhenUsed/>
+    <w:tblPr>
+      <w:tblInd w:w="0" w:type="dxa"/>
+      <w:tblCellMar>
+        <w:top w:w="0" w:type="dxa"/>
+        <w:left w:w="108" w:type="dxa"/>
+        <w:bottom w:w="0" w:type="dxa"/>
+        <w:right w:w="108" w:type="dxa"/>
+      </w:tblCellMar>
+    </w:tblPr>
+  </w:style>
+  <w:style w:type="numbering" w:default="1" w:styleId="NoList">
+    <w:name w:val="No List"/>
+    <w:uiPriority w:val="99"/>
+    <w:semiHidden/>
+    <w:unhideWhenUsed/>
+  </w:style>
+  <w:style w:type="character" w:styleId="PlaceholderText">
+    <w:name w:val="Placeholder Text"/>
+    <w:basedOn w:val="DefaultParagraphFont"/>
+    <w:uiPriority w:val="99"/>
+    <w:semiHidden/>
+    <w:rsid w:val="00B308CE"/>
+    <w:rPr>
+      <w:color w:val="808080"/>
+    </w:rPr>
+  </w:style>
+</w:styles>
+</file>
+
+<file path=word/glossary/webSettings.xml><?xml version="1.0" encoding="utf-8"?>
+<w:webSettings xmlns:mc="http://schemas.openxmlformats.org/markup-compatibility/2006" xmlns:r="http://schemas.openxmlformats.org/officeDocument/2006/relationships" xmlns:w="http://schemas.openxmlformats.org/wordprocessingml/2006/main" xmlns:w14="http://schemas.microsoft.com/office/word/2010/wordml" xmlns:w15="http://schemas.microsoft.com/office/word/2012/wordml" xmlns:w16se="http://schemas.microsoft.com/office/word/2015/wordml/symex" mc:Ignorable="w14 w15 w16se">
+  <w:optimizeForBrowser/>
+  <w:allowPNG/>
+</w:webSettings>
+</file>
+
 <file path=word/theme/theme1.xml><?xml version="1.0" encoding="utf-8"?>
 <a:theme xmlns:a="http://schemas.openxmlformats.org/drawingml/2006/main" name="Office Theme">
   <a:themeElements>
@@ -27469,7 +28473,7 @@
 </file>
 
 <file path=customXml/itemProps1.xml><?xml version="1.0" encoding="utf-8"?>
-<ds:datastoreItem xmlns:ds="http://schemas.openxmlformats.org/officeDocument/2006/customXml" ds:itemID="{22915FBD-C5F2-4D5A-902E-1EAFCCA325B9}">
+<ds:datastoreItem xmlns:ds="http://schemas.openxmlformats.org/officeDocument/2006/customXml" ds:itemID="{B7FD8FF5-8FDA-47BF-9415-DAE679C0A61A}">
   <ds:schemaRefs>
     <ds:schemaRef ds:uri="http://schemas.openxmlformats.org/officeDocument/2006/bibliography"/>
   </ds:schemaRefs>

</xml_diff>